<commit_message>
harden project-owner analysis semantics and documentation
</commit_message>
<xml_diff>
--- a/preregistration/package/00_protocol/Validation_Protocol_PreReg_v0.17.docx
+++ b/preregistration/package/00_protocol/Validation_Protocol_PreReg_v0.17.docx
@@ -896,12 +896,12 @@
     </w:p>
     <w:p>
       <w:r>
-        <w:t>Project owners will review production-model-proposed labels for their projects. They will see the public entry, proposals and short definitions, but will not classify from scratch. For each proposal, they will separately judge actual-project fit and public-entry visibility and may identify missing labels. A fit/correctness explanation is required only for an explicit not-fit judgement; Unsure requests no explanation. Other conditional explanations are optional.</w:t>
-      </w:r>
-    </w:p>
-    <w:p>
-      <w:r>
-        <w:t>Owner review is a project-informed case-level validity signal and should not be interpreted as a portfolio-level gold standard. Owners may use information unavailable to the production model and scratch coders, so the stream helps distinguish apparent classification problems from register insufficiency and project-knowledge gaps. Because owners review proposed labels, their responses may be affected by anchoring or acquiescence and are reported separately from independent coder agreement.</w:t>
+        <w:t>Project owners will review production-model-proposed labels for projects on which they are named. They will see the public entry, proposed labels and short taxonomy definitions, but will not apply the full taxonomy from scratch. For each proposed label, they will separately judge whether it describes the actual project and whether its basis is visible in the public register entry. They may identify missing labels. A fit/correctness explanation is required only for an explicit not-fit judgement; Unsure requests no explanation. Other conditional explanations are optional. Detailed definitions and branching logic are specified in the archived REDCap data dictionary.</w:t>
+      </w:r>
+    </w:p>
+    <w:p>
+      <w:r>
+        <w:t>Owner review is a project-informed case-level validity signal and should not be interpreted as a portfolio-level gold standard. Owners may use information unavailable to the production model and scratch coders. Their structured and optional signals support subsequent adjudication of apparent classification problems, register insufficiency and project-knowledge gaps; they do not automatically establish a definitive error source. Owner disagreement is evidence for adjudication, not itself a gold-standard classification error. Because owners review proposed labels, their responses may be affected by anchoring or acquiescence and are reported separately from independent coder agreement.</w:t>
       </w:r>
     </w:p>
     <w:p>
@@ -970,7 +970,7 @@
     </w:p>
     <w:p>
       <w:r>
-        <w:t>Project-owner participation will be voluntary. Invitation materials will explain the purpose of the review, the information collected, how responses will be analysed and reported, and the deadline for withdrawal before analysis begins. Names, professional contact routes and the owner-ID mapping will be held in a separate restricted recruitment/contact table; direct identifiers will be absent from the pseudonymous REDCap response project. Named responses and raw comments will not be published without permission, and comments containing non-public project information will be redacted or summarised.</w:t>
+        <w:t>Project-owner participation will be voluntary. Invitation materials will explain the purpose of the review, the information collected, how responses will be analysed and reported, and the deadline for withdrawal before analysis begins. For withdrawal purposes, analysis begins when substantive analysis of project-owner responses starts after data collection and preparation; routine administrative monitoring and data-quality checks do not themselves end the withdrawal period. Names, professional contact routes and the owner-ID mapping will be held in a separate restricted recruitment/contact table; direct identifiers will be absent from the pseudonymous REDCap response project. Named responses and raw comments will not be published without permission, and comments containing non-public project information will be redacted or summarised.</w:t>
       </w:r>
     </w:p>
     <w:p/>
@@ -1032,7 +1032,7 @@
     </w:p>
     <w:p>
       <w:r>
-        <w:t>Owners separately judge the actual-project fit and public visibility of every proposed Domain, Purpose and both tag statuses. Domains are unranked and multi-label; at most two Purposes are assigned. Required structured items cover missing classifications, public-entry sufficiency, project knowledge and taxonomy fit. Conditional free text is required only for an explicit not-fit judgement, because adjudication must interpret disagreement. Unsure requests no explanation: requiring it would penalise honest uncertainty already characterised by required visibility and taxonomy-fit judgements. Other conditional explanations are optional and do not determine analytical completeness. An omitted existing label belongs in the missing-classification section; “No suitable category exists in the framework” records a taxonomy gap. Owner evidence is purposive and project-informed, not a register-wide accuracy estimate or gold standard.</w:t>
+        <w:t>Owners separately judge the actual-project fit and public visibility of every proposed Domain, Purpose and both tag statuses. Public visibility is judged per proposed label; project knowledge and taxonomy fit are overall project-level diagnostics and do not independently explain every label decision. Domains are unranked and multi-label; at most two Purposes are assigned. Required structured items cover missing classifications, public-entry sufficiency, project knowledge and taxonomy fit. Conditional free text is required only for an explicit not-fit judgement because adjudication must interpret disagreement. Unsure requests no explanation, avoiding a penalty for honest uncertainty; explicit disagreement still has greater response burden, so fit proportions will be interpreted with this residual asymmetry in mind. Other conditional explanations are optional enrichment and do not determine analytical completeness. An omitted existing label belongs in the missing-classification section; “No suitable category exists in the framework” records a taxonomy gap. These signals support adjudication rather than automatically establishing a definitive error source, and owner disagreement is not itself a gold-standard classification error or a register-wide accuracy estimate.</w:t>
       </w:r>
     </w:p>
     <w:p>
@@ -1497,7 +1497,7 @@
         <w:spacing w:before="240" w:after="240" w:line="252" w:lineRule="auto"/>
       </w:pPr>
       <w:r>
-        <w:t>Missing-label findings will be reported by owner–record response and as the proportion of reviewed records where an owner identifies a missing label. Sufficiency and taxonomy-fit ratings will be reported among analytically complete responses. Submission should normally imply completion because branching enforces structured items and explicit-disagreement explanations, but analysis will verify it after joining owner consent by owner_id; optional explanations do not determine completion.</w:t>
+        <w:t>Missing-label findings will be reported by owner–record response and as the proportion of reviewed records where an owner identifies a missing label. Sufficiency and taxonomy-fit ratings will be reported among analytically complete responses. Blank optional prose means not provided and is not interpreted as no issue, no missing information, no taxonomy problem or no reliance on project knowledge. Structured responses are the primary analytical outcomes. Qualitative themes and quotations will report the number of comments contributing evidence and will not be treated as prevalence estimates. Raw retained values from fields hidden by a changed parent response are preserved but excluded from derived completion and analysis variables under the final branching state. Submission should normally imply completion because branching enforces structured items and explicit-disagreement explanations, but analysis will verify it after joining owner consent by owner_id; optional explanations do not determine completion.</w:t>
       </w:r>
     </w:p>
     <w:p>

</xml_diff>